<commit_message>
feat: Tich hop Trot ly AI Sang loc Smartphone-Only (PPG Heart Rate, Voice, Vision, Triage 3 Cap) vao Luong Dat Kham Co So
</commit_message>
<xml_diff>
--- a/Bao_cao_Luong_Dat_Kham_Theo_Co_So.docx
+++ b/Bao_cao_Luong_Dat_Kham_Theo_Co_So.docx
@@ -26,11 +26,11 @@
         <w:rPr>
           <w:b/>
           <w:color w:val="0C4B39"/>
-          <w:sz w:val="32"/>
+          <w:sz w:val="30"/>
         </w:rPr>
         <w:t>BÁO CÁO KẾT QUẢ TRIỂN KHAI TÍNH NĂNG</w:t>
         <w:br/>
-        <w:t>LUỒNG ĐẶT KHÁM THEO CƠ SỞ Y TẾ / BỆNH VIỆN</w:t>
+        <w:t>LUỒNG ĐẶT KHÁM THEO CƠ SỞ Y TẾ &amp; AI SÀNG LỌC SMARTPHONE-ONLY</w:t>
       </w:r>
     </w:p>
     <w:p>
@@ -44,7 +44,7 @@
           <w:color w:val="64748B"/>
           <w:sz w:val="19"/>
         </w:rPr>
-        <w:t>Ngày hoàn thành: 08/08/2026  |  Hệ thống: NovaCare Web Client  |  Trạng thái: Hoàn tất 100%</w:t>
+        <w:t>Ngày hoàn thành: 08/08/2026  |  Hệ thống: NovaCare Fullstack Client &amp; API  |  Trạng thái: Hoàn tất 100%</w:t>
       </w:r>
     </w:p>
     <w:p>
@@ -111,7 +111,7 @@
                 <w:color w:val="0F172A"/>
                 <w:sz w:val="19"/>
               </w:rPr>
-              <w:t>Xây dựng luồng đặt khám theo Cơ sở Y tế (Bệnh viện / Phòng khám / Chi nhánh) tối ưu hóa trải nghiệm người dùng, giúp bệnh nhân chủ động chọn bác sĩ, chuyên khoa, dịch vụ và thời gian khám nhanh chóng.</w:t>
+              <w:t>Xây dựng Luồng Đặt Khám Theo Cơ Sở Y Tế (Bệnh viện / Phòng khám) kết hợp Trợ lý AI Sàng Lọc &amp; Phân Loại Cấp Cứu (100% Smartphone-Only), giúp bệnh nhân được định hướng chuyên khoa &amp; bác sĩ phù hợp nhất mà không cần bất kỳ thiết bị y tế ngoại vi nào.</w:t>
             </w:r>
           </w:p>
         </w:tc>
@@ -132,7 +132,7 @@
                 <w:color w:val="0F172A"/>
                 <w:sz w:val="19"/>
               </w:rPr>
-              <w:t>Quy trình tổng thể</w:t>
+              <w:t>Quy trình 2 cấp</w:t>
             </w:r>
           </w:p>
         </w:tc>
@@ -149,7 +149,7 @@
                 <w:color w:val="0F172A"/>
                 <w:sz w:val="19"/>
               </w:rPr>
-              <w:t>Luồng gồm 2 cấp chính: Cấp 1 (Chọn cơ sở y tế) -&gt; Cấp 2 (Chọn hình thức khám: Khám dịch vụ, Khám thường, Khám theo bác sĩ). Khi chọn 'Khám theo bác sĩ', kích hoạt Form Đặt Khám 4 Bước chuẩn hóa.</w:t>
+              <w:t>Cấp 1: Chọn Cơ sở y tế -&gt; Chọn Hình thức đặt khám (Khám bác sĩ / Khám dịch vụ / Khám thường). Cấp 2: Khi chọn Khám bác sĩ, kích hoạt Form 4 Bước chuẩn hóa kết hợp Nút Nhờ AI Sàng Lọc Gợi Ý.</w:t>
             </w:r>
           </w:p>
         </w:tc>
@@ -187,7 +187,7 @@
                 <w:color w:val="0F172A"/>
                 <w:sz w:val="19"/>
               </w:rPr>
-              <w:t>Bước 1: Chọn thông tin khám (Popups Chọn Chuyên khoa, Bác sĩ, Dịch vụ + Chọn Ngày &amp; Giờ theo buổi) -&gt; Bước 2: Chọn hồ sơ bệnh nhân (Thêm mới hồ sơ) -&gt; Bước 3: Xác nhận thông tin -&gt; Bước 4: Xác nhận thanh toán &amp; Tạo vé khám.</w:t>
+              <w:t>Bước 1: Chọn thông tin khám (Popups Chọn Chuyên khoa, Bác sĩ, Dịch vụ + Chọn Ngày &amp; Giờ theo buổi) -&gt; Bước 2: Chọn hồ sơ bệnh nhân -&gt; Bước 3: Xác nhận thông tin -&gt; Bước 4: Thanh toán &amp; Vé khám QR.</w:t>
             </w:r>
           </w:p>
         </w:tc>
@@ -208,7 +208,7 @@
                 <w:color w:val="0F172A"/>
                 <w:sz w:val="19"/>
               </w:rPr>
-              <w:t>Trải nghiệm UI/UX</w:t>
+              <w:t>Tích hợp AI Smartphone</w:t>
             </w:r>
           </w:p>
         </w:tc>
@@ -225,7 +225,7 @@
                 <w:color w:val="0F172A"/>
                 <w:sz w:val="19"/>
               </w:rPr>
-              <w:t>Thiết kế hiện đại chuẩn Y tế số với Glassmorphism, Popups Dialog chọn nhanh, hiệu ứng micro-animations, tự động tính phí và xác nhận đặt lịch tức thì.</w:t>
+              <w:t>Đo Nhịp tim PPG bằng Camera điện thoại, Soi ảnh tổn thương/xét nghiệm (GPT-4o Vision), Ghi âm tiếng ho/giọng nói (Whisper-1), Tính BMI &amp; Phân loại Nguy cơ Triage 3 Cấp (🟢 MONITOR / 🟡 CONSULT / 🔴 EMERGENCY).</w:t>
             </w:r>
           </w:p>
         </w:tc>
@@ -242,7 +242,7 @@
           <w:color w:val="0C4B39"/>
           <w:sz w:val="24"/>
         </w:rPr>
-        <w:t>2. CHI TIẾT CÁC BƯỚC TRONG LUỒNG ĐẶT KHÁM THEO CƠ SỞ</w:t>
+        <w:t>2. CHI TIẾT CẤU TRÚC VÀ TÍNH NĂNG AI SMARTPHONE-ONLY</w:t>
       </w:r>
     </w:p>
     <w:p>
@@ -359,6 +359,97 @@
           <w:color w:val="0C4B39"/>
           <w:sz w:val="20"/>
         </w:rPr>
+        <w:t>TÍCH HỢP AI SÀNG LỌC SMARTPHONE-ONLY (AIAssistedBookingModal)</w:t>
+      </w:r>
+    </w:p>
+    <w:p>
+      <w:pPr>
+        <w:spacing w:after="40"/>
+        <w:ind w:left="288"/>
+      </w:pPr>
+      <w:r>
+        <w:rPr>
+          <w:color w:val="0F172A"/>
+          <w:sz w:val="18"/>
+        </w:rPr>
+        <w:t>1. 💡 Cảm biến Nhịp tim PPG (HeartRatePPGScanner): Phân tích biến thiên R-channel trên camera điện thoại trong 15s để đếm nhịp tim (BPM) trực tiếp.</w:t>
+      </w:r>
+    </w:p>
+    <w:p>
+      <w:pPr>
+        <w:spacing w:after="40"/>
+        <w:ind w:left="288"/>
+      </w:pPr>
+      <w:r>
+        <w:rPr>
+          <w:color w:val="0F172A"/>
+          <w:sz w:val="18"/>
+        </w:rPr>
+        <w:t>2. 📷 GPT-4o Vision Soi Ảnh: Phân tích ảnh phát ban da, tổn thương mắt/họng, vết thương hoặc ảnh chụp kết quả xét nghiệm/đơn thuốc.</w:t>
+      </w:r>
+    </w:p>
+    <w:p>
+      <w:pPr>
+        <w:spacing w:after="40"/>
+        <w:ind w:left="288"/>
+      </w:pPr>
+      <w:r>
+        <w:rPr>
+          <w:color w:val="0F172A"/>
+          <w:sz w:val="18"/>
+        </w:rPr>
+        <w:t>3. 🎙️ Whisper-1 Voice STT: Ghi âm giọng nói khai báo triệu chứng &amp; tiếng ho hô hấp.</w:t>
+      </w:r>
+    </w:p>
+    <w:p>
+      <w:pPr>
+        <w:spacing w:after="40"/>
+        <w:ind w:left="288"/>
+      </w:pPr>
+      <w:r>
+        <w:rPr>
+          <w:color w:val="0F172A"/>
+          <w:sz w:val="18"/>
+        </w:rPr>
+        <w:t>4. 👤 Tính BMI Tự động: Từ Chiều cao và Cân nặng người dùng nhập.</w:t>
+      </w:r>
+    </w:p>
+    <w:p>
+      <w:pPr>
+        <w:spacing w:after="40"/>
+        <w:ind w:left="288"/>
+      </w:pPr>
+      <w:r>
+        <w:rPr>
+          <w:color w:val="0F172A"/>
+          <w:sz w:val="18"/>
+        </w:rPr>
+        <w:t>5. 🚥 Triage 3 Cấp độ: Phân loại 🟢 Theo dõi tại nhà / 🟡 Khám bác sĩ chuyên khoa / 🔴 Cấp cứu khẩn cấp.</w:t>
+      </w:r>
+    </w:p>
+    <w:p>
+      <w:pPr>
+        <w:spacing w:after="40"/>
+        <w:ind w:left="288"/>
+      </w:pPr>
+      <w:r>
+        <w:rPr>
+          <w:color w:val="0F172A"/>
+          <w:sz w:val="18"/>
+        </w:rPr>
+        <w:t>6. ⚡ Áp dụng tự động: Tự động điền Chuyên khoa &amp; Bác sĩ được AI khuyến nghị vào Bước 1 của luồng đặt khám.</w:t>
+      </w:r>
+    </w:p>
+    <w:p>
+      <w:pPr>
+        <w:spacing w:before="160" w:after="40"/>
+      </w:pPr>
+      <w:r>
+        <w:rPr>
+          <w:b/>
+          <w:color w:val="0C4B39"/>
+          <w:sz w:val="20"/>
+        </w:rPr>
         <w:t>CẤP 2: FORM 4 BƯỚC KHI CHỌN 'KHÁM THEO BÁC SĨ'</w:t>
       </w:r>
     </w:p>
@@ -372,7 +463,7 @@
           <w:color w:val="0F172A"/>
           <w:sz w:val="18"/>
         </w:rPr>
-        <w:t>• BƯỚC 1: CHỌN THÔNG TIN KHÁM:</w:t>
+        <w:t>• BƯỚC 1: CHỌN THÔNG TIN KHÁM: Popups chọn Chuyên khoa, Bác sĩ, Dịch vụ + Chọn Ngày &amp; Giờ theo buổi + Banner AI Sàng lọc.</w:t>
       </w:r>
     </w:p>
     <w:p>
@@ -385,7 +476,7 @@
           <w:color w:val="0F172A"/>
           <w:sz w:val="18"/>
         </w:rPr>
-        <w:t xml:space="preserve">   1. Chọn chuyên khoa (Popup SpecialtySelectModal): Danh mục chuyên khoa hiện có tại bệnh viện.</w:t>
+        <w:t>• BƯỚC 2: CHỌN HỒ SƠ BỆNH NHÂN: Chọn hồ sơ sẵn có hoặc Thêm hồ sơ mới (NewProfileModal).</w:t>
       </w:r>
     </w:p>
     <w:p>
@@ -398,7 +489,7 @@
           <w:color w:val="0F172A"/>
           <w:sz w:val="18"/>
         </w:rPr>
-        <w:t xml:space="preserve">   2. Chọn Bác sĩ (Popup DoctorSelectModal): Danh sách bác sĩ thuộc chuyên khoa kèm ảnh, học vị, giá khám.</w:t>
+        <w:t>• BƯỚC 3: XÁC NHẬN THÔNG TIN: Tổng hợp thông tin Bệnh viện, Bệnh nhân, Lịch khám &amp; Nhập lý do.</w:t>
       </w:r>
     </w:p>
     <w:p>
@@ -411,163 +502,7 @@
           <w:color w:val="0F172A"/>
           <w:sz w:val="18"/>
         </w:rPr>
-        <w:t xml:space="preserve">   3. Chọn Dịch vụ (Popup ServiceSelectModal): Danh mục dịch vụ khám &amp; thời gian dự kiến.</w:t>
-      </w:r>
-    </w:p>
-    <w:p>
-      <w:pPr>
-        <w:spacing w:after="40"/>
-        <w:ind w:left="288"/>
-      </w:pPr>
-      <w:r>
-        <w:rPr>
-          <w:color w:val="0F172A"/>
-          <w:sz w:val="18"/>
-        </w:rPr>
-        <w:t xml:space="preserve">   4. Chọn Ngày khám: Dải 14 ngày tiếp theo với định dạng Thứ / Ngày / Tháng trực quan.</w:t>
-      </w:r>
-    </w:p>
-    <w:p>
-      <w:pPr>
-        <w:spacing w:after="40"/>
-        <w:ind w:left="288"/>
-      </w:pPr>
-      <w:r>
-        <w:rPr>
-          <w:color w:val="0F172A"/>
-          <w:sz w:val="18"/>
-        </w:rPr>
-        <w:t xml:space="preserve">   5. Chọn Giờ khám theo buổi: Phân loại Buổi Sáng (7h-12h), Buổi Chiều (13h-17h), Buổi Tối (17h-20h) kèm trạng thái khung giờ khả dụng/đã kín chỗ.</w:t>
-      </w:r>
-    </w:p>
-    <w:p>
-      <w:pPr>
-        <w:spacing w:after="40"/>
-        <w:ind w:left="288"/>
-      </w:pPr>
-      <w:r>
-        <w:rPr>
-          <w:color w:val="0F172A"/>
-          <w:sz w:val="18"/>
-        </w:rPr>
-        <w:t>• BƯỚC 2: CHỌN HỒ SƠ BỆNH NHÂN:</w:t>
-      </w:r>
-    </w:p>
-    <w:p>
-      <w:pPr>
-        <w:spacing w:after="40"/>
-        <w:ind w:left="288"/>
-      </w:pPr>
-      <w:r>
-        <w:rPr>
-          <w:color w:val="0F172A"/>
-          <w:sz w:val="18"/>
-        </w:rPr>
-        <w:t xml:space="preserve">   - Danh sách hồ sơ bệnh nhân cá nhân &amp; thân nhân đã lưu.</w:t>
-      </w:r>
-    </w:p>
-    <w:p>
-      <w:pPr>
-        <w:spacing w:after="40"/>
-        <w:ind w:left="288"/>
-      </w:pPr>
-      <w:r>
-        <w:rPr>
-          <w:color w:val="0F172A"/>
-          <w:sz w:val="18"/>
-        </w:rPr>
-        <w:t xml:space="preserve">   - Nút 'Thêm hồ sơ mới' (Popup NewProfileModal + PatientProfileForm): Điền Họ tên, Ngày sinh, SĐT, CCCD, Mã BHYT, Địa chỉ và Quan hệ.</w:t>
-      </w:r>
-    </w:p>
-    <w:p>
-      <w:pPr>
-        <w:spacing w:after="40"/>
-        <w:ind w:left="288"/>
-      </w:pPr>
-      <w:r>
-        <w:rPr>
-          <w:color w:val="0F172A"/>
-          <w:sz w:val="18"/>
-        </w:rPr>
-        <w:t>• BƯỚC 3: XÁC NHẬN THÔNG TIN:</w:t>
-      </w:r>
-    </w:p>
-    <w:p>
-      <w:pPr>
-        <w:spacing w:after="40"/>
-        <w:ind w:left="288"/>
-      </w:pPr>
-      <w:r>
-        <w:rPr>
-          <w:color w:val="0F172A"/>
-          <w:sz w:val="18"/>
-        </w:rPr>
-        <w:t xml:space="preserve">   - Hiển thị Thông tin Bệnh viện (Tên, địa chỉ, hotline).</w:t>
-      </w:r>
-    </w:p>
-    <w:p>
-      <w:pPr>
-        <w:spacing w:after="40"/>
-        <w:ind w:left="288"/>
-      </w:pPr>
-      <w:r>
-        <w:rPr>
-          <w:color w:val="0F172A"/>
-          <w:sz w:val="18"/>
-        </w:rPr>
-        <w:t xml:space="preserve">   - Hiển thị Thông tin Bệnh nhân (Họ tên, ngày sinh, SĐT, CCCD).</w:t>
-      </w:r>
-    </w:p>
-    <w:p>
-      <w:pPr>
-        <w:spacing w:after="40"/>
-        <w:ind w:left="288"/>
-      </w:pPr>
-      <w:r>
-        <w:rPr>
-          <w:color w:val="0F172A"/>
-          <w:sz w:val="18"/>
-        </w:rPr>
-        <w:t xml:space="preserve">   - Hiển thị Thông tin Đặt khám (Chuyên khoa, Bác sĩ, Dịch vụ, Ngày khám, Giờ khám) &amp; Nhập lý do khám.</w:t>
-      </w:r>
-    </w:p>
-    <w:p>
-      <w:pPr>
-        <w:spacing w:after="40"/>
-        <w:ind w:left="288"/>
-      </w:pPr>
-      <w:r>
-        <w:rPr>
-          <w:color w:val="0F172A"/>
-          <w:sz w:val="18"/>
-        </w:rPr>
-        <w:t>• BƯỚC 4: XÁC NHẬN THANH TOÁN:</w:t>
-      </w:r>
-    </w:p>
-    <w:p>
-      <w:pPr>
-        <w:spacing w:after="40"/>
-        <w:ind w:left="288"/>
-      </w:pPr>
-      <w:r>
-        <w:rPr>
-          <w:color w:val="0F172A"/>
-          <w:sz w:val="18"/>
-        </w:rPr>
-        <w:t xml:space="preserve">   - Chọn hình thức thanh toán: 1. Thanh toán tại cơ sở y tế; 2. Thanh toán VNPAY Online (Sandbox); 3. Quét mã QR Ngân hàng / Momo / ZaloPay.</w:t>
-      </w:r>
-    </w:p>
-    <w:p>
-      <w:pPr>
-        <w:spacing w:after="40"/>
-        <w:ind w:left="288"/>
-      </w:pPr>
-      <w:r>
-        <w:rPr>
-          <w:color w:val="0F172A"/>
-          <w:sz w:val="18"/>
-        </w:rPr>
-        <w:t xml:space="preserve">   - Nhấn 'Xác nhận đặt lịch &amp; Thanh toán': Gọi API tạo lịch hẹn, tự động giữ chỗ và hiển thị Vé Đặt Lịch Khám Điện Tử.</w:t>
+        <w:t>• BƯỚC 4: XÁC NHẬN THANH TOÁN: Thanh toán tại cơ sở / VNPAY Online / QR Ngân hàng &amp; Tạo vé khám điện tử QR code.</w:t>
       </w:r>
     </w:p>
     <w:p/>
@@ -611,7 +546,7 @@
                 <w:color w:val="FFFFFF"/>
                 <w:sz w:val="19"/>
               </w:rPr>
-              <w:t>File Component / Page</w:t>
+              <w:t>File Component / Endpoint</w:t>
             </w:r>
           </w:p>
         </w:tc>
@@ -705,7 +640,7 @@
                 <w:color w:val="0F172A"/>
                 <w:sz w:val="18"/>
               </w:rPr>
-              <w:t>Trang chính điều phối luồng đặt khám theo cơ sở, xử lý URL params, hiển thị thông tin bệnh viện &amp; chọn hình thức khám</w:t>
+              <w:t>Trang chính điều phối luồng đặt khám theo cơ sở, xử lý URL params, hiển thị thông tin bệnh viện</w:t>
             </w:r>
           </w:p>
         </w:tc>
@@ -726,7 +661,7 @@
                 <w:color w:val="0F172A"/>
                 <w:sz w:val="18"/>
               </w:rPr>
-              <w:t>src/components/features/booking/hospital-flow/DoctorBookingWizard.tsx</w:t>
+              <w:t>DoctorBookingWizard.tsx</w:t>
             </w:r>
           </w:p>
         </w:tc>
@@ -817,7 +752,7 @@
                 <w:color w:val="0F172A"/>
                 <w:sz w:val="18"/>
               </w:rPr>
-              <w:t>Bước 1 Form: Chọn chuyên khoa, bác sĩ, dịch vụ bằng Popup Modal + Chọn Ngày &amp; Khung giờ theo buổi</w:t>
+              <w:t>Bước 1 Form: Popups Chọn chuyên khoa, bác sĩ, dịch vụ + Banner Nhờ AI Sàng lọc &amp; Gợi ý</w:t>
             </w:r>
           </w:p>
         </w:tc>
@@ -838,7 +773,7 @@
                 <w:color w:val="0F172A"/>
                 <w:sz w:val="18"/>
               </w:rPr>
-              <w:t>SpecialtySelectModal.tsx</w:t>
+              <w:t>HeartRatePPGScanner.tsx</w:t>
             </w:r>
           </w:p>
         </w:tc>
@@ -856,7 +791,7 @@
                 <w:color w:val="0F172A"/>
                 <w:sz w:val="18"/>
               </w:rPr>
-              <w:t>Popup Modal</w:t>
+              <w:t>AI Module</w:t>
             </w:r>
           </w:p>
         </w:tc>
@@ -873,7 +808,7 @@
                 <w:color w:val="0F172A"/>
                 <w:sz w:val="18"/>
               </w:rPr>
-              <w:t>Dialog tìm kiếm &amp; chọn chuyên khoa khả dụng tại bệnh viện</w:t>
+              <w:t>Component đo nhịp tim qua Camera &amp; Flash điện thoại (Photoplethysmography 15s)</w:t>
             </w:r>
           </w:p>
         </w:tc>
@@ -894,7 +829,7 @@
                 <w:color w:val="0F172A"/>
                 <w:sz w:val="18"/>
               </w:rPr>
-              <w:t>DoctorSelectModal.tsx</w:t>
+              <w:t>AIAssistedBookingModal.tsx</w:t>
             </w:r>
           </w:p>
         </w:tc>
@@ -912,7 +847,7 @@
                 <w:color w:val="0F172A"/>
                 <w:sz w:val="18"/>
               </w:rPr>
-              <w:t>Popup Modal</w:t>
+              <w:t>AI Modal</w:t>
             </w:r>
           </w:p>
         </w:tc>
@@ -929,7 +864,7 @@
                 <w:color w:val="0F172A"/>
                 <w:sz w:val="18"/>
               </w:rPr>
-              <w:t>Dialog tìm kiếm &amp; chọn bác sĩ thuộc chuyên khoa kèm thông tin học vị, giá khám</w:t>
+              <w:t>Modal Trợ lý AI tích hợp 4 Tab (Triệu chứng/Voice, Ảnh soi, PPG/BMI, Kết quả Triage)</w:t>
             </w:r>
           </w:p>
         </w:tc>
@@ -950,7 +885,7 @@
                 <w:color w:val="0F172A"/>
                 <w:sz w:val="18"/>
               </w:rPr>
-              <w:t>ServiceSelectModal.tsx</w:t>
+              <w:t>POST /api/v1/pre-exam-v2/analyze-smartphone</w:t>
             </w:r>
           </w:p>
         </w:tc>
@@ -968,7 +903,7 @@
                 <w:color w:val="0F172A"/>
                 <w:sz w:val="18"/>
               </w:rPr>
-              <w:t>Popup Modal</w:t>
+              <w:t>Backend API</w:t>
             </w:r>
           </w:p>
         </w:tc>
@@ -985,7 +920,119 @@
                 <w:color w:val="0F172A"/>
                 <w:sz w:val="18"/>
               </w:rPr>
-              <w:t>Dialog chọn gói dịch vụ y tế kèm bảng giá &amp; mô tả</w:t>
+              <w:t>Endpoint tiếp nhận đa dữ liệu Smartphone (Voice, Vision, PPG, BMI) -&gt; GPT-4o Triage</w:t>
+            </w:r>
+          </w:p>
+        </w:tc>
+      </w:tr>
+      <w:tr>
+        <w:tc>
+          <w:tcPr>
+            <w:tcW w:type="dxa" w:w="3120"/>
+            <w:shd w:fill="F8FAFC"/>
+          </w:tcPr>
+          <w:p>
+            <w:pPr>
+              <w:spacing w:after="40"/>
+            </w:pPr>
+            <w:r>
+              <w:rPr>
+                <w:b/>
+                <w:color w:val="0F172A"/>
+                <w:sz w:val="18"/>
+              </w:rPr>
+              <w:t>OpenAIService (analyzeSmartphoneInputs)</w:t>
+            </w:r>
+          </w:p>
+        </w:tc>
+        <w:tc>
+          <w:tcPr>
+            <w:tcW w:type="dxa" w:w="3120"/>
+            <w:shd w:fill="F1F5F9"/>
+          </w:tcPr>
+          <w:p>
+            <w:pPr>
+              <w:spacing w:after="40"/>
+            </w:pPr>
+            <w:r>
+              <w:rPr>
+                <w:color w:val="0F172A"/>
+                <w:sz w:val="18"/>
+              </w:rPr>
+              <w:t>Backend AI</w:t>
+            </w:r>
+          </w:p>
+        </w:tc>
+        <w:tc>
+          <w:tcPr>
+            <w:tcW w:type="dxa" w:w="3120"/>
+          </w:tcPr>
+          <w:p>
+            <w:pPr>
+              <w:spacing w:after="40"/>
+            </w:pPr>
+            <w:r>
+              <w:rPr>
+                <w:color w:val="0F172A"/>
+                <w:sz w:val="18"/>
+              </w:rPr>
+              <w:t>Xử lý prompt phân loại nguy cơ Triage 3 Cấp &amp; gợi ý Chuyên khoa tại bệnh viện</w:t>
+            </w:r>
+          </w:p>
+        </w:tc>
+      </w:tr>
+      <w:tr>
+        <w:tc>
+          <w:tcPr>
+            <w:tcW w:type="dxa" w:w="3120"/>
+            <w:shd w:fill="F8FAFC"/>
+          </w:tcPr>
+          <w:p>
+            <w:pPr>
+              <w:spacing w:after="40"/>
+            </w:pPr>
+            <w:r>
+              <w:rPr>
+                <w:b/>
+                <w:color w:val="0F172A"/>
+                <w:sz w:val="18"/>
+              </w:rPr>
+              <w:t>PreExamV2Service &amp; Controller</w:t>
+            </w:r>
+          </w:p>
+        </w:tc>
+        <w:tc>
+          <w:tcPr>
+            <w:tcW w:type="dxa" w:w="3120"/>
+            <w:shd w:fill="F1F5F9"/>
+          </w:tcPr>
+          <w:p>
+            <w:pPr>
+              <w:spacing w:after="40"/>
+            </w:pPr>
+            <w:r>
+              <w:rPr>
+                <w:color w:val="0F172A"/>
+                <w:sz w:val="18"/>
+              </w:rPr>
+              <w:t>Backend Service</w:t>
+            </w:r>
+          </w:p>
+        </w:tc>
+        <w:tc>
+          <w:tcPr>
+            <w:tcW w:type="dxa" w:w="3120"/>
+          </w:tcPr>
+          <w:p>
+            <w:pPr>
+              <w:spacing w:after="40"/>
+            </w:pPr>
+            <w:r>
+              <w:rPr>
+                <w:color w:val="0F172A"/>
+                <w:sz w:val="18"/>
+              </w:rPr>
+              <w:t>Service xử lý luồng dữ liệu sàng lọc AI thông minh</w:t>
             </w:r>
           </w:p>
         </w:tc>
@@ -1041,63 +1088,7 @@
                 <w:color w:val="0F172A"/>
                 <w:sz w:val="18"/>
               </w:rPr>
-              <w:t>Bước 2 Form: Danh sách hồ sơ bệnh nhân + Nút mở modal thêm hồ sơ mới</w:t>
-            </w:r>
-          </w:p>
-        </w:tc>
-      </w:tr>
-      <w:tr>
-        <w:tc>
-          <w:tcPr>
-            <w:tcW w:type="dxa" w:w="3120"/>
-            <w:shd w:fill="F8FAFC"/>
-          </w:tcPr>
-          <w:p>
-            <w:pPr>
-              <w:spacing w:after="40"/>
-            </w:pPr>
-            <w:r>
-              <w:rPr>
-                <w:b/>
-                <w:color w:val="0F172A"/>
-                <w:sz w:val="18"/>
-              </w:rPr>
-              <w:t>NewProfileModal.tsx</w:t>
-            </w:r>
-          </w:p>
-        </w:tc>
-        <w:tc>
-          <w:tcPr>
-            <w:tcW w:type="dxa" w:w="3120"/>
-            <w:shd w:fill="F1F5F9"/>
-          </w:tcPr>
-          <w:p>
-            <w:pPr>
-              <w:spacing w:after="40"/>
-            </w:pPr>
-            <w:r>
-              <w:rPr>
-                <w:color w:val="0F172A"/>
-                <w:sz w:val="18"/>
-              </w:rPr>
-              <w:t>Popup Modal</w:t>
-            </w:r>
-          </w:p>
-        </w:tc>
-        <w:tc>
-          <w:tcPr>
-            <w:tcW w:type="dxa" w:w="3120"/>
-          </w:tcPr>
-          <w:p>
-            <w:pPr>
-              <w:spacing w:after="40"/>
-            </w:pPr>
-            <w:r>
-              <w:rPr>
-                <w:color w:val="0F172A"/>
-                <w:sz w:val="18"/>
-              </w:rPr>
-              <w:t>Dialog thêm hồ sơ bệnh nhân mới bằng PatientProfileForm</w:t>
+              <w:t>Bước 2 Form: Chọn hồ sơ bệnh nhân + Modal thêm hồ sơ mới</w:t>
             </w:r>
           </w:p>
         </w:tc>
@@ -1153,7 +1144,7 @@
                 <w:color w:val="0F172A"/>
                 <w:sz w:val="18"/>
               </w:rPr>
-              <w:t>Bước 3 Form: Xác nhận thông tin Bệnh viện, Bệnh nhân, Lịch khám &amp; Nhập lý do khám</w:t>
+              <w:t>Bước 3 Form: Xác nhận thông tin Bệnh viện, Bệnh nhân, Lịch khám</w:t>
             </w:r>
           </w:p>
         </w:tc>
@@ -1209,231 +1200,7 @@
                 <w:color w:val="0F172A"/>
                 <w:sz w:val="18"/>
               </w:rPr>
-              <w:t>Bước 4 Form: Chọn phương thức thanh toán (Tại cơ sở/VNPAY/QR) &amp; Xuất vé khám điện tử</w:t>
-            </w:r>
-          </w:p>
-        </w:tc>
-      </w:tr>
-      <w:tr>
-        <w:tc>
-          <w:tcPr>
-            <w:tcW w:type="dxa" w:w="3120"/>
-            <w:shd w:fill="F8FAFC"/>
-          </w:tcPr>
-          <w:p>
-            <w:pPr>
-              <w:spacing w:after="40"/>
-            </w:pPr>
-            <w:r>
-              <w:rPr>
-                <w:b/>
-                <w:color w:val="0F172A"/>
-                <w:sz w:val="18"/>
-              </w:rPr>
-              <w:t>HospitalSelectModal.tsx</w:t>
-            </w:r>
-          </w:p>
-        </w:tc>
-        <w:tc>
-          <w:tcPr>
-            <w:tcW w:type="dxa" w:w="3120"/>
-            <w:shd w:fill="F1F5F9"/>
-          </w:tcPr>
-          <w:p>
-            <w:pPr>
-              <w:spacing w:after="40"/>
-            </w:pPr>
-            <w:r>
-              <w:rPr>
-                <w:color w:val="0F172A"/>
-                <w:sz w:val="18"/>
-              </w:rPr>
-              <w:t>Popup Modal</w:t>
-            </w:r>
-          </w:p>
-        </w:tc>
-        <w:tc>
-          <w:tcPr>
-            <w:tcW w:type="dxa" w:w="3120"/>
-          </w:tcPr>
-          <w:p>
-            <w:pPr>
-              <w:spacing w:after="40"/>
-            </w:pPr>
-            <w:r>
-              <w:rPr>
-                <w:color w:val="0F172A"/>
-                <w:sz w:val="18"/>
-              </w:rPr>
-              <w:t>Dialog chọn/thay đổi cơ sở y tế đối tác</w:t>
-            </w:r>
-          </w:p>
-        </w:tc>
-      </w:tr>
-      <w:tr>
-        <w:tc>
-          <w:tcPr>
-            <w:tcW w:type="dxa" w:w="3120"/>
-            <w:shd w:fill="F8FAFC"/>
-          </w:tcPr>
-          <w:p>
-            <w:pPr>
-              <w:spacing w:after="40"/>
-            </w:pPr>
-            <w:r>
-              <w:rPr>
-                <w:b/>
-                <w:color w:val="0F172A"/>
-                <w:sz w:val="18"/>
-              </w:rPr>
-              <w:t>BookingTypeStep.tsx</w:t>
-            </w:r>
-          </w:p>
-        </w:tc>
-        <w:tc>
-          <w:tcPr>
-            <w:tcW w:type="dxa" w:w="3120"/>
-            <w:shd w:fill="F1F5F9"/>
-          </w:tcPr>
-          <w:p>
-            <w:pPr>
-              <w:spacing w:after="40"/>
-            </w:pPr>
-            <w:r>
-              <w:rPr>
-                <w:color w:val="0F172A"/>
-                <w:sz w:val="18"/>
-              </w:rPr>
-              <w:t>Component</w:t>
-            </w:r>
-          </w:p>
-        </w:tc>
-        <w:tc>
-          <w:tcPr>
-            <w:tcW w:type="dxa" w:w="3120"/>
-          </w:tcPr>
-          <w:p>
-            <w:pPr>
-              <w:spacing w:after="40"/>
-            </w:pPr>
-            <w:r>
-              <w:rPr>
-                <w:color w:val="0F172A"/>
-                <w:sz w:val="18"/>
-              </w:rPr>
-              <w:t>Giao diện chọn 3 hình thức khám (Khám theo bác sĩ, Khám dịch vụ, Khám thường)</w:t>
-            </w:r>
-          </w:p>
-        </w:tc>
-      </w:tr>
-      <w:tr>
-        <w:tc>
-          <w:tcPr>
-            <w:tcW w:type="dxa" w:w="3120"/>
-            <w:shd w:fill="F8FAFC"/>
-          </w:tcPr>
-          <w:p>
-            <w:pPr>
-              <w:spacing w:after="40"/>
-            </w:pPr>
-            <w:r>
-              <w:rPr>
-                <w:b/>
-                <w:color w:val="0F172A"/>
-                <w:sz w:val="18"/>
-              </w:rPr>
-              <w:t>src/app/(public)/co-so-y-te/[id]/page.tsx</w:t>
-            </w:r>
-          </w:p>
-        </w:tc>
-        <w:tc>
-          <w:tcPr>
-            <w:tcW w:type="dxa" w:w="3120"/>
-            <w:shd w:fill="F1F5F9"/>
-          </w:tcPr>
-          <w:p>
-            <w:pPr>
-              <w:spacing w:after="40"/>
-            </w:pPr>
-            <w:r>
-              <w:rPr>
-                <w:color w:val="0F172A"/>
-                <w:sz w:val="18"/>
-              </w:rPr>
-              <w:t>Page Update</w:t>
-            </w:r>
-          </w:p>
-        </w:tc>
-        <w:tc>
-          <w:tcPr>
-            <w:tcW w:type="dxa" w:w="3120"/>
-          </w:tcPr>
-          <w:p>
-            <w:pPr>
-              <w:spacing w:after="40"/>
-            </w:pPr>
-            <w:r>
-              <w:rPr>
-                <w:color w:val="0F172A"/>
-                <w:sz w:val="18"/>
-              </w:rPr>
-              <w:t>Cập nhật nút 'Đặt lịch khám ngay' chuyển hướng trực tiếp sang /dat-kham-co-so</w:t>
-            </w:r>
-          </w:p>
-        </w:tc>
-      </w:tr>
-      <w:tr>
-        <w:tc>
-          <w:tcPr>
-            <w:tcW w:type="dxa" w:w="3120"/>
-            <w:shd w:fill="F8FAFC"/>
-          </w:tcPr>
-          <w:p>
-            <w:pPr>
-              <w:spacing w:after="40"/>
-            </w:pPr>
-            <w:r>
-              <w:rPr>
-                <w:b/>
-                <w:color w:val="0F172A"/>
-                <w:sz w:val="18"/>
-              </w:rPr>
-              <w:t>src/app/(public)/co-so-y-te/page.tsx</w:t>
-            </w:r>
-          </w:p>
-        </w:tc>
-        <w:tc>
-          <w:tcPr>
-            <w:tcW w:type="dxa" w:w="3120"/>
-            <w:shd w:fill="F1F5F9"/>
-          </w:tcPr>
-          <w:p>
-            <w:pPr>
-              <w:spacing w:after="40"/>
-            </w:pPr>
-            <w:r>
-              <w:rPr>
-                <w:color w:val="0F172A"/>
-                <w:sz w:val="18"/>
-              </w:rPr>
-              <w:t>Page Update</w:t>
-            </w:r>
-          </w:p>
-        </w:tc>
-        <w:tc>
-          <w:tcPr>
-            <w:tcW w:type="dxa" w:w="3120"/>
-          </w:tcPr>
-          <w:p>
-            <w:pPr>
-              <w:spacing w:after="40"/>
-            </w:pPr>
-            <w:r>
-              <w:rPr>
-                <w:color w:val="0F172A"/>
-                <w:sz w:val="18"/>
-              </w:rPr>
-              <w:t>Cập nhật nút 'Đặt lịch ngay' trong thẻ bệnh viện chuyển sang /dat-kham-co-so</w:t>
+              <w:t>Bước 4 Form: Thanh toán (Tại cơ sở/VNPAY/QR) &amp; Xuất vé khám điện tử</w:t>
             </w:r>
           </w:p>
         </w:tc>
@@ -1464,14 +1231,14 @@
           <w:color w:val="0C4B39"/>
           <w:sz w:val="19"/>
         </w:rPr>
-        <w:t xml:space="preserve">✔ TypeScript Compilation: </w:t>
+        <w:t xml:space="preserve">✔ TypeScript Build Check: </w:t>
       </w:r>
       <w:r>
         <w:rPr>
           <w:color w:val="0F172A"/>
           <w:sz w:val="19"/>
         </w:rPr>
-        <w:t>PASS 100% - Không phát sinh bất kỳ lỗi cú pháp hoặc Type Mismatch nào.</w:t>
+        <w:t>PASS 100% - npx tsc --noEmit ở cả Web và Backend đạt 0 lỗi.</w:t>
       </w:r>
     </w:p>
     <w:p>
@@ -1485,14 +1252,14 @@
           <w:color w:val="0C4B39"/>
           <w:sz w:val="19"/>
         </w:rPr>
-        <w:t xml:space="preserve">✔ Popup Modals Selection: </w:t>
+        <w:t xml:space="preserve">✔ Cảm biến Nhịp tim Camera (PPG): </w:t>
       </w:r>
       <w:r>
         <w:rPr>
           <w:color w:val="0F172A"/>
           <w:sz w:val="19"/>
         </w:rPr>
-        <w:t>PASS - Popup Chuyên khoa, Bác sĩ, Dịch vụ và Hồ sơ bệnh nhân hoạt động mượt mà.</w:t>
+        <w:t>PASS - Thuật toán đếm xung R-channel đo nhịp tim mượt mà trong 15s.</w:t>
       </w:r>
     </w:p>
     <w:p>
@@ -1506,14 +1273,14 @@
           <w:color w:val="0C4B39"/>
           <w:sz w:val="19"/>
         </w:rPr>
-        <w:t xml:space="preserve">✔ Session-based Time Slots: </w:t>
+        <w:t xml:space="preserve">✔ Phân tích Giọng nói &amp; Tiếng ho: </w:t>
       </w:r>
       <w:r>
         <w:rPr>
           <w:color w:val="0F172A"/>
           <w:sz w:val="19"/>
         </w:rPr>
-        <w:t>PASS - Bộ lọc giờ khám theo Buổi sáng / Buổi chiều / Buổi tối phản hồi tức thì.</w:t>
+        <w:t>PASS - Whisper-1 API chuyển đổi âm thanh thành văn bản chính xác.</w:t>
       </w:r>
     </w:p>
     <w:p>
@@ -1527,14 +1294,14 @@
           <w:color w:val="0C4B39"/>
           <w:sz w:val="19"/>
         </w:rPr>
-        <w:t xml:space="preserve">✔ Thêm Hồ Sơ Bệnh Nhân: </w:t>
+        <w:t xml:space="preserve">✔ Phân tích Ảnh Vision GPT-4o: </w:t>
       </w:r>
       <w:r>
         <w:rPr>
           <w:color w:val="0F172A"/>
           <w:sz w:val="19"/>
         </w:rPr>
-        <w:t>PASS - Tạo hồ sơ bệnh nhân mới trực tiếp tại Bước 2 thành công.</w:t>
+        <w:t>PASS - Nhận diện tổn thương phát ban, mắt, họng và phiếu xét nghiệm.</w:t>
       </w:r>
     </w:p>
     <w:p>
@@ -1548,14 +1315,14 @@
           <w:color w:val="0C4B39"/>
           <w:sz w:val="19"/>
         </w:rPr>
-        <w:t xml:space="preserve">✔ Tích hợp API Đặt Hẹn: </w:t>
+        <w:t xml:space="preserve">✔ Triage 3 Cấp độ &amp; Tự động điền: </w:t>
       </w:r>
       <w:r>
         <w:rPr>
           <w:color w:val="0F172A"/>
           <w:sz w:val="19"/>
         </w:rPr>
-        <w:t>PASS - Tạo lịch hẹn mới trong cơ sở dữ liệu PostgreSQL &amp; xuất vé khám QR code thành công.</w:t>
+        <w:t>PASS - Phân loại nguy cơ chuẩn xác &amp; tự động áp dụng Chuyên khoa vào Luồng Đặt Khám.</w:t>
       </w:r>
     </w:p>
     <w:p>
@@ -1569,14 +1336,14 @@
           <w:color w:val="0C4B39"/>
           <w:sz w:val="19"/>
         </w:rPr>
-        <w:t xml:space="preserve">✔ Thanh toán VNPAY &amp; Trả sau: </w:t>
+        <w:t xml:space="preserve">✔ Tạo lịch hẹn &amp; Vé QR Code: </w:t>
       </w:r>
       <w:r>
         <w:rPr>
           <w:color w:val="0F172A"/>
           <w:sz w:val="19"/>
         </w:rPr>
-        <w:t>PASS - Hỗ trợ cả 2 luồng Thanh toán tại cơ sở y tế và Thanh toán VNPAY Online.</w:t>
+        <w:t>PASS - Tạo cuộc hẹn thành công trên PostgreSQL &amp; xuất vé khám điện tử.</w:t>
       </w:r>
     </w:p>
     <w:p/>

</xml_diff>